<commit_message>
Sadness has befallen me
</commit_message>
<xml_diff>
--- a/Git Guide.docx
+++ b/Git Guide.docx
@@ -114,7 +114,7 @@
       </w:r>
       <w:r>
         <w:drawing>
-          <wp:inline wp14:editId="414E1BF1" wp14:anchorId="3D13E2FF">
+          <wp:inline wp14:editId="449F30A6" wp14:anchorId="3D13E2FF">
             <wp:extent cx="5724525" cy="2924175"/>
             <wp:effectExtent l="0" t="0" r="0" b="0"/>
             <wp:docPr id="327956292" name="drawing"/>
@@ -160,7 +160,7 @@
       </w:r>
       <w:r>
         <w:drawing>
-          <wp:inline wp14:editId="0ABAF332" wp14:anchorId="5872255D">
+          <wp:inline wp14:editId="1FC72E4B" wp14:anchorId="5872255D">
             <wp:extent cx="5495925" cy="3152775"/>
             <wp:effectExtent l="0" t="0" r="0" b="0"/>
             <wp:docPr id="588059935" name="drawing"/>
@@ -330,7 +330,7 @@
       </w:r>
       <w:r>
         <w:drawing>
-          <wp:inline wp14:editId="6F7C8C32" wp14:anchorId="64915E4E">
+          <wp:inline wp14:editId="4DD6E6CE" wp14:anchorId="64915E4E">
             <wp:extent cx="5495925" cy="3810000"/>
             <wp:effectExtent l="0" t="0" r="0" b="0"/>
             <wp:docPr id="2123739380" name="drawing"/>
@@ -433,7 +433,7 @@
       </w:r>
       <w:r>
         <w:drawing>
-          <wp:inline wp14:editId="374D3DA8" wp14:anchorId="32D4BC40">
+          <wp:inline wp14:editId="74EF909D" wp14:anchorId="32D4BC40">
             <wp:extent cx="4305901" cy="2600688"/>
             <wp:effectExtent l="0" t="0" r="0" b="0"/>
             <wp:docPr id="2032629644" name="drawing"/>
@@ -530,7 +530,7 @@
       </w:pPr>
       <w:r>
         <w:drawing>
-          <wp:inline wp14:editId="5237A59F" wp14:anchorId="261A0B77">
+          <wp:inline wp14:editId="6BFFA4C8" wp14:anchorId="261A0B77">
             <wp:extent cx="5724525" cy="4010025"/>
             <wp:effectExtent l="0" t="0" r="0" b="0"/>
             <wp:docPr id="1948313273" name="drawing"/>
@@ -624,7 +624,7 @@
       </w:pPr>
       <w:r>
         <w:drawing>
-          <wp:inline wp14:editId="13DA0BC1" wp14:anchorId="2B0CCFE3">
+          <wp:inline wp14:editId="4A5EA995" wp14:anchorId="2B0CCFE3">
             <wp:extent cx="5724525" cy="3371850"/>
             <wp:effectExtent l="0" t="0" r="0" b="0"/>
             <wp:docPr id="1690846218" name="drawing"/>
@@ -731,7 +731,7 @@
       </w:pPr>
       <w:r>
         <w:drawing>
-          <wp:inline wp14:editId="3A755173" wp14:anchorId="25D9F80A">
+          <wp:inline wp14:editId="297CB7FD" wp14:anchorId="25D9F80A">
             <wp:extent cx="5724525" cy="3209925"/>
             <wp:effectExtent l="0" t="0" r="0" b="0"/>
             <wp:docPr id="627348898" name="drawing"/>
@@ -844,7 +844,7 @@
       </w:pPr>
       <w:r>
         <w:drawing>
-          <wp:inline wp14:editId="6642ECD7" wp14:anchorId="0875CCE1">
+          <wp:inline wp14:editId="7D418921" wp14:anchorId="0875CCE1">
             <wp:extent cx="5724525" cy="3228975"/>
             <wp:effectExtent l="0" t="0" r="0" b="0"/>
             <wp:docPr id="1398062686" name="drawing"/>
@@ -887,6 +887,20 @@
       </w:r>
     </w:p>
     <w:p>
+      <w:r>
+        <w:br w:type="page"/>
+      </w:r>
+    </w:p>
+    <w:p>
+      <w:pPr>
+        <w:pStyle w:val="ListParagraph"/>
+        <w:bidi w:val="0"/>
+        <w:spacing w:before="0" w:beforeAutospacing="off" w:after="160" w:afterAutospacing="off" w:line="279" w:lineRule="auto"/>
+        <w:ind w:left="720" w:right="0"/>
+        <w:jc w:val="left"/>
+      </w:pPr>
+    </w:p>
+    <w:p>
       <w:pPr>
         <w:pStyle w:val="ListParagraph"/>
         <w:numPr>
@@ -899,16 +913,110 @@
         <w:ind w:right="0"/>
         <w:jc w:val="left"/>
         <w:rPr>
-          <w:b w:val="0"/>
-          <w:bCs w:val="0"/>
-        </w:rPr>
-      </w:pPr>
-      <w:r>
-        <w:rPr>
-          <w:b w:val="0"/>
-          <w:bCs w:val="0"/>
-        </w:rPr>
-        <w:t>X</w:t>
+          <w:b w:val="1"/>
+          <w:bCs w:val="1"/>
+        </w:rPr>
+      </w:pPr>
+      <w:r>
+        <w:rPr>
+          <w:b w:val="1"/>
+          <w:bCs w:val="1"/>
+        </w:rPr>
+        <w:t>[git checkout</w:t>
+      </w:r>
+      <w:r>
+        <w:rPr>
+          <w:b w:val="1"/>
+          <w:bCs w:val="1"/>
+        </w:rPr>
+        <w:t>]</w:t>
+      </w:r>
+    </w:p>
+    <w:p>
+      <w:pPr>
+        <w:pStyle w:val="ListParagraph"/>
+        <w:suppressLineNumbers w:val="0"/>
+        <w:bidi w:val="0"/>
+        <w:spacing w:before="0" w:beforeAutospacing="off" w:after="160" w:afterAutospacing="off" w:line="279" w:lineRule="auto"/>
+        <w:ind w:left="720" w:right="0"/>
+        <w:jc w:val="left"/>
+        <w:rPr>
+          <w:b w:val="0"/>
+          <w:bCs w:val="0"/>
+        </w:rPr>
+      </w:pPr>
+      <w:r>
+        <w:rPr>
+          <w:b w:val="0"/>
+          <w:bCs w:val="0"/>
+        </w:rPr>
+        <w:t xml:space="preserve">Manages branches with functions like switching, </w:t>
+      </w:r>
+      <w:r>
+        <w:rPr>
+          <w:b w:val="0"/>
+          <w:bCs w:val="0"/>
+        </w:rPr>
+        <w:t>adding</w:t>
+      </w:r>
+      <w:r>
+        <w:rPr>
+          <w:b w:val="0"/>
+          <w:bCs w:val="0"/>
+        </w:rPr>
+        <w:t xml:space="preserve"> and removing.</w:t>
+      </w:r>
+    </w:p>
+    <w:p>
+      <w:pPr>
+        <w:pStyle w:val="ListParagraph"/>
+        <w:bidi w:val="0"/>
+        <w:spacing w:before="0" w:beforeAutospacing="off" w:after="160" w:afterAutospacing="off" w:line="279" w:lineRule="auto"/>
+        <w:ind w:left="720" w:right="0"/>
+        <w:jc w:val="left"/>
+      </w:pPr>
+      <w:r>
+        <w:drawing>
+          <wp:inline wp14:editId="6ACE1D89" wp14:anchorId="07451FE3">
+            <wp:extent cx="5657850" cy="4448175"/>
+            <wp:effectExtent l="0" t="0" r="0" b="0"/>
+            <wp:docPr id="1475575799" name="drawing"/>
+            <wp:cNvGraphicFramePr>
+              <a:graphicFrameLocks noChangeAspect="1"/>
+            </wp:cNvGraphicFramePr>
+            <a:graphic>
+              <a:graphicData xmlns:a="http://schemas.openxmlformats.org/drawingml/2006/main" uri="http://schemas.openxmlformats.org/drawingml/2006/picture">
+                <pic:pic xmlns:pic="http://schemas.openxmlformats.org/drawingml/2006/picture">
+                  <pic:nvPicPr>
+                    <pic:cNvPr id="1475575799" name="Picture 1475575799"/>
+                    <pic:cNvPicPr/>
+                  </pic:nvPicPr>
+                  <pic:blipFill>
+                    <a:blip xmlns:r="http://schemas.openxmlformats.org/officeDocument/2006/relationships" r:embed="rId624863801">
+                      <a:extLst>
+                        <a:ext uri="{28A0092B-C50C-407E-A947-70E740481C1C}">
+                          <a14:useLocalDpi xmlns:a14="http://schemas.microsoft.com/office/drawing/2010/main"/>
+                        </a:ext>
+                      </a:extLst>
+                    </a:blip>
+                    <a:stretch>
+                      <a:fillRect/>
+                    </a:stretch>
+                  </pic:blipFill>
+                  <pic:spPr>
+                    <a:xfrm rot="0">
+                      <a:off x="0" y="0"/>
+                      <a:ext cx="5657850" cy="4448175"/>
+                    </a:xfrm>
+                    <a:prstGeom prst="rect">
+                      <a:avLst/>
+                    </a:prstGeom>
+                  </pic:spPr>
+                </pic:pic>
+              </a:graphicData>
+            </a:graphic>
+          </wp:inline>
+        </w:drawing>
       </w:r>
     </w:p>
     <w:p>
@@ -930,10 +1038,41 @@
       </w:pPr>
       <w:r>
         <w:rPr>
-          <w:b w:val="0"/>
-          <w:bCs w:val="0"/>
-        </w:rPr>
-        <w:t>X</w:t>
+          <w:b w:val="1"/>
+          <w:bCs w:val="1"/>
+        </w:rPr>
+        <w:t>[git merge]</w:t>
+      </w:r>
+    </w:p>
+    <w:p>
+      <w:pPr>
+        <w:pStyle w:val="ListParagraph"/>
+        <w:suppressLineNumbers w:val="0"/>
+        <w:bidi w:val="0"/>
+        <w:spacing w:before="0" w:beforeAutospacing="off" w:after="160" w:afterAutospacing="off" w:line="279" w:lineRule="auto"/>
+        <w:ind w:left="720" w:right="0"/>
+        <w:jc w:val="left"/>
+      </w:pPr>
+      <w:r>
+        <w:rPr>
+          <w:b w:val="0"/>
+          <w:bCs w:val="0"/>
+        </w:rPr>
+        <w:t xml:space="preserve">Merges </w:t>
+      </w:r>
+      <w:r>
+        <w:rPr>
+          <w:b w:val="0"/>
+          <w:bCs w:val="0"/>
+        </w:rPr>
+        <w:t>2 branches</w:t>
+      </w:r>
+      <w:r>
+        <w:rPr>
+          <w:b w:val="0"/>
+          <w:bCs w:val="0"/>
+        </w:rPr>
+        <w:t xml:space="preserve"> into 1.</w:t>
       </w:r>
     </w:p>
     <w:p>
@@ -1624,7 +1763,7 @@
     <w:name w:val="List Paragraph"/>
     <w:basedOn w:val="Normal"/>
     <w:qFormat/>
-    <w:rsid w:val="19F156A8"/>
+    <w:rsid w:val="2F8DB583"/>
     <w:pPr>
       <w:spacing/>
       <w:ind w:left="720"/>

</xml_diff>